<commit_message>
refactor: streamline and declutter Focus Cockpit UI for deep focused work
</commit_message>
<xml_diff>
--- a/docs/03_DEVELOPMENT_CHANGELOG_DETAILS.docx
+++ b/docs/03_DEVELOPMENT_CHANGELOG_DETAILS.docx
@@ -36557,6 +36557,502 @@
           <w:b/>
           <w:bCs/>
         </w:rPr>
+        <w:t xml:space="preserve">Kết quả kiểm tra:</w:t>
+      </w:r>
+      <w:r>
+        <w:rPr>
+          <w:rFonts w:ascii="Calibri" w:cs="Calibri" w:eastAsia="Calibri" w:hAnsi="Calibri"/>
+        </w:rPr>
+        <w:t xml:space="preserve"> Cả Backend (</w:t>
+      </w:r>
+      <w:r>
+        <w:rPr>
+          <w:rFonts w:ascii="Consolas" w:cs="Consolas" w:eastAsia="Consolas" w:hAnsi="Consolas"/>
+          <w:sz w:val="20"/>
+          <w:szCs w:val="20"/>
+          <w:shd w:fill="F1F5F9"/>
+        </w:rPr>
+        <w:t xml:space="preserve">be</w:t>
+      </w:r>
+      <w:r>
+        <w:rPr>
+          <w:rFonts w:ascii="Calibri" w:cs="Calibri" w:eastAsia="Calibri" w:hAnsi="Calibri"/>
+        </w:rPr>
+        <w:t xml:space="preserve">) và Frontend (</w:t>
+      </w:r>
+      <w:r>
+        <w:rPr>
+          <w:rFonts w:ascii="Consolas" w:cs="Consolas" w:eastAsia="Consolas" w:hAnsi="Consolas"/>
+          <w:sz w:val="20"/>
+          <w:szCs w:val="20"/>
+          <w:shd w:fill="F1F5F9"/>
+        </w:rPr>
+        <w:t xml:space="preserve">fe</w:t>
+      </w:r>
+      <w:r>
+        <w:rPr>
+          <w:rFonts w:ascii="Calibri" w:cs="Calibri" w:eastAsia="Calibri" w:hAnsi="Calibri"/>
+        </w:rPr>
+        <w:t xml:space="preserve">) build đạt 100% (Exit Code 0).</w:t>
+      </w:r>
+    </w:p>
+    <w:p>
+      <w:pPr>
+        <w:pBdr>
+          <w:bottom w:color="CBD5E1" w:sz="6" w:space="1"/>
+        </w:pBdr>
+        <w:spacing w:after="120" w:before="120"/>
+      </w:pPr>
+    </w:p>
+    <w:p>
+      <w:pPr>
+        <w:pStyle w:val="Heading2"/>
+        <w:spacing w:after="120" w:before="240"/>
+      </w:pPr>
+      <w:r>
+        <w:rPr>
+          <w:rFonts w:ascii="Calibri" w:cs="Calibri" w:eastAsia="Calibri" w:hAnsi="Calibri"/>
+          <w:b/>
+          <w:bCs/>
+          <w:color w:val="0F172A"/>
+          <w:sz w:val="28"/>
+          <w:szCs w:val="28"/>
+        </w:rPr>
+        <w:t xml:space="preserve">133. Hiện Thực Hóa Cơ Chế Thành Viên Tự Tạo Task Con &amp; Bao Phủ 20 Corner Cases</w:t>
+      </w:r>
+    </w:p>
+    <w:p>
+      <w:pPr>
+        <w:pStyle w:val="ListParagraph"/>
+        <w:numPr>
+          <w:ilvl w:val="0"/>
+          <w:numId w:val="1"/>
+        </w:numPr>
+        <w:spacing w:after="40" w:before="40"/>
+      </w:pPr>
+      <w:r>
+        <w:rPr>
+          <w:rFonts w:ascii="Calibri" w:cs="Calibri" w:eastAsia="Calibri" w:hAnsi="Calibri"/>
+          <w:b/>
+          <w:bCs/>
+        </w:rPr>
+        <w:t xml:space="preserve">File 1:</w:t>
+      </w:r>
+      <w:r>
+        <w:rPr>
+          <w:rFonts w:ascii="Calibri" w:cs="Calibri" w:eastAsia="Calibri" w:hAnsi="Calibri"/>
+        </w:rPr>
+        <w:t xml:space="preserve"> </w:t>
+      </w:r>
+      <w:r>
+        <w:rPr>
+          <w:rFonts w:ascii="Consolas" w:cs="Consolas" w:eastAsia="Consolas" w:hAnsi="Consolas"/>
+          <w:sz w:val="20"/>
+          <w:szCs w:val="20"/>
+          <w:shd w:fill="F1F5F9"/>
+        </w:rPr>
+        <w:t xml:space="preserve">be/src/modules/task/task.service.ts</w:t>
+      </w:r>
+      <w:r>
+        <w:rPr>
+          <w:rFonts w:ascii="Calibri" w:cs="Calibri" w:eastAsia="Calibri" w:hAnsi="Calibri"/>
+        </w:rPr>
+        <w:t xml:space="preserve">
+- </w:t>
+      </w:r>
+      <w:r>
+        <w:rPr>
+          <w:rFonts w:ascii="Calibri" w:cs="Calibri" w:eastAsia="Calibri" w:hAnsi="Calibri"/>
+          <w:b/>
+          <w:bCs/>
+        </w:rPr>
+        <w:t xml:space="preserve">Hành động:</w:t>
+      </w:r>
+      <w:r>
+        <w:rPr>
+          <w:rFonts w:ascii="Calibri" w:cs="Calibri" w:eastAsia="Calibri" w:hAnsi="Calibri"/>
+        </w:rPr>
+        <w:t xml:space="preserve"> </w:t>
+      </w:r>
+      <w:r>
+        <w:rPr>
+          <w:rFonts w:ascii="Consolas" w:cs="Consolas" w:eastAsia="Consolas" w:hAnsi="Consolas"/>
+          <w:sz w:val="20"/>
+          <w:szCs w:val="20"/>
+          <w:shd w:fill="F1F5F9"/>
+        </w:rPr>
+        <w:t xml:space="preserve">[NÂNG CẤP TOÀN DIỆN HÀM ADDSUBTASK &amp; PHÂN QUYỀN MỞ RỘNG CHO THÀNH VIÊN]</w:t>
+      </w:r>
+      <w:r>
+        <w:rPr>
+          <w:rFonts w:ascii="Calibri" w:cs="Calibri" w:eastAsia="Calibri" w:hAnsi="Calibri"/>
+        </w:rPr>
+        <w:t xml:space="preserve">.
+- </w:t>
+      </w:r>
+      <w:r>
+        <w:rPr>
+          <w:rFonts w:ascii="Calibri" w:cs="Calibri" w:eastAsia="Calibri" w:hAnsi="Calibri"/>
+          <w:b/>
+          <w:bCs/>
+        </w:rPr>
+        <w:t xml:space="preserve">Chi tiết:</w:t>
+      </w:r>
+      <w:r>
+        <w:rPr>
+          <w:rFonts w:ascii="Calibri" w:cs="Calibri" w:eastAsia="Calibri" w:hAnsi="Calibri"/>
+        </w:rPr>
+        <w:t xml:space="preserve"> 
+  - Mở quyền cho Thành viên thuộc dự án (</w:t>
+      </w:r>
+      <w:r>
+        <w:rPr>
+          <w:rFonts w:ascii="Consolas" w:cs="Consolas" w:eastAsia="Consolas" w:hAnsi="Consolas"/>
+          <w:sz w:val="20"/>
+          <w:szCs w:val="20"/>
+          <w:shd w:fill="F1F5F9"/>
+        </w:rPr>
+        <w:t xml:space="preserve">project_members</w:t>
+      </w:r>
+      <w:r>
+        <w:rPr>
+          <w:rFonts w:ascii="Calibri" w:cs="Calibri" w:eastAsia="Calibri" w:hAnsi="Calibri"/>
+        </w:rPr>
+        <w:t xml:space="preserve">) được tự tạo subtask phân rã công việc.
+  - Tự động gán </w:t>
+      </w:r>
+      <w:r>
+        <w:rPr>
+          <w:rFonts w:ascii="Consolas" w:cs="Consolas" w:eastAsia="Consolas" w:hAnsi="Consolas"/>
+          <w:sz w:val="20"/>
+          <w:szCs w:val="20"/>
+          <w:shd w:fill="F1F5F9"/>
+        </w:rPr>
+        <w:t xml:space="preserve">assigneeId = user.id</w:t>
+      </w:r>
+      <w:r>
+        <w:rPr>
+          <w:rFonts w:ascii="Calibri" w:cs="Calibri" w:eastAsia="Calibri" w:hAnsi="Calibri"/>
+        </w:rPr>
+        <w:t xml:space="preserve"> khi nhân viên không chọn người khác.
+  - Tự động co giãn </w:t>
+      </w:r>
+      <w:r>
+        <w:rPr>
+          <w:rFonts w:ascii="Consolas" w:cs="Consolas" w:eastAsia="Consolas" w:hAnsi="Consolas"/>
+          <w:sz w:val="20"/>
+          <w:szCs w:val="20"/>
+          <w:shd w:fill="F1F5F9"/>
+        </w:rPr>
+        <w:t xml:space="preserve">task.startDate</w:t>
+      </w:r>
+      <w:r>
+        <w:rPr>
+          <w:rFonts w:ascii="Calibri" w:cs="Calibri" w:eastAsia="Calibri" w:hAnsi="Calibri"/>
+        </w:rPr>
+        <w:t xml:space="preserve"> khi subtask bắt đầu sớm hơn task cha.
+  - Khóa thêm subtask khi Task đang </w:t>
+      </w:r>
+      <w:r>
+        <w:rPr>
+          <w:rFonts w:ascii="Consolas" w:cs="Consolas" w:eastAsia="Consolas" w:hAnsi="Consolas"/>
+          <w:sz w:val="20"/>
+          <w:szCs w:val="20"/>
+          <w:shd w:fill="F1F5F9"/>
+        </w:rPr>
+        <w:t xml:space="preserve">PAUSED</w:t>
+      </w:r>
+      <w:r>
+        <w:rPr>
+          <w:rFonts w:ascii="Calibri" w:cs="Calibri" w:eastAsia="Calibri" w:hAnsi="Calibri"/>
+        </w:rPr>
+        <w:t xml:space="preserve">, </w:t>
+      </w:r>
+      <w:r>
+        <w:rPr>
+          <w:rFonts w:ascii="Consolas" w:cs="Consolas" w:eastAsia="Consolas" w:hAnsi="Consolas"/>
+          <w:sz w:val="20"/>
+          <w:szCs w:val="20"/>
+          <w:shd w:fill="F1F5F9"/>
+        </w:rPr>
+        <w:t xml:space="preserve">BLOCKED</w:t>
+      </w:r>
+      <w:r>
+        <w:rPr>
+          <w:rFonts w:ascii="Calibri" w:cs="Calibri" w:eastAsia="Calibri" w:hAnsi="Calibri"/>
+        </w:rPr>
+        <w:t xml:space="preserve">, </w:t>
+      </w:r>
+      <w:r>
+        <w:rPr>
+          <w:rFonts w:ascii="Consolas" w:cs="Consolas" w:eastAsia="Consolas" w:hAnsi="Consolas"/>
+          <w:sz w:val="20"/>
+          <w:szCs w:val="20"/>
+          <w:shd w:fill="F1F5F9"/>
+        </w:rPr>
+        <w:t xml:space="preserve">isArchived</w:t>
+      </w:r>
+      <w:r>
+        <w:rPr>
+          <w:rFonts w:ascii="Calibri" w:cs="Calibri" w:eastAsia="Calibri" w:hAnsi="Calibri"/>
+        </w:rPr>
+        <w:t xml:space="preserve">, hoặc đang </w:t>
+      </w:r>
+      <w:r>
+        <w:rPr>
+          <w:rFonts w:ascii="Consolas" w:cs="Consolas" w:eastAsia="Consolas" w:hAnsi="Consolas"/>
+          <w:sz w:val="20"/>
+          <w:szCs w:val="20"/>
+          <w:shd w:fill="F1F5F9"/>
+        </w:rPr>
+        <w:t xml:space="preserve">IN_REVIEW</w:t>
+      </w:r>
+      <w:r>
+        <w:rPr>
+          <w:rFonts w:ascii="Calibri" w:cs="Calibri" w:eastAsia="Calibri" w:hAnsi="Calibri"/>
+        </w:rPr>
+        <w:t xml:space="preserve"> chờ bàn giao.
+  - Chuẩn hóa thời lượng làm việc </w:t>
+      </w:r>
+      <w:r>
+        <w:rPr>
+          <w:rFonts w:ascii="Consolas" w:cs="Consolas" w:eastAsia="Consolas" w:hAnsi="Consolas"/>
+          <w:sz w:val="20"/>
+          <w:szCs w:val="20"/>
+          <w:shd w:fill="F1F5F9"/>
+        </w:rPr>
+        <w:t xml:space="preserve">Math.max(1, Math.floor(estimatedDays))</w:t>
+      </w:r>
+      <w:r>
+        <w:rPr>
+          <w:rFonts w:ascii="Calibri" w:cs="Calibri" w:eastAsia="Calibri" w:hAnsi="Calibri"/>
+        </w:rPr>
+        <w:t xml:space="preserve">.</w:t>
+      </w:r>
+    </w:p>
+    <w:p>
+      <w:pPr>
+        <w:pStyle w:val="ListParagraph"/>
+        <w:numPr>
+          <w:ilvl w:val="0"/>
+          <w:numId w:val="1"/>
+        </w:numPr>
+        <w:spacing w:after="40" w:before="40"/>
+      </w:pPr>
+      <w:r>
+        <w:rPr>
+          <w:rFonts w:ascii="Calibri" w:cs="Calibri" w:eastAsia="Calibri" w:hAnsi="Calibri"/>
+          <w:b/>
+          <w:bCs/>
+        </w:rPr>
+        <w:t xml:space="preserve">Kết quả kiểm tra:</w:t>
+      </w:r>
+      <w:r>
+        <w:rPr>
+          <w:rFonts w:ascii="Calibri" w:cs="Calibri" w:eastAsia="Calibri" w:hAnsi="Calibri"/>
+        </w:rPr>
+        <w:t xml:space="preserve"> Cả Backend (</w:t>
+      </w:r>
+      <w:r>
+        <w:rPr>
+          <w:rFonts w:ascii="Consolas" w:cs="Consolas" w:eastAsia="Consolas" w:hAnsi="Consolas"/>
+          <w:sz w:val="20"/>
+          <w:szCs w:val="20"/>
+          <w:shd w:fill="F1F5F9"/>
+        </w:rPr>
+        <w:t xml:space="preserve">be</w:t>
+      </w:r>
+      <w:r>
+        <w:rPr>
+          <w:rFonts w:ascii="Calibri" w:cs="Calibri" w:eastAsia="Calibri" w:hAnsi="Calibri"/>
+        </w:rPr>
+        <w:t xml:space="preserve">) và Frontend (</w:t>
+      </w:r>
+      <w:r>
+        <w:rPr>
+          <w:rFonts w:ascii="Consolas" w:cs="Consolas" w:eastAsia="Consolas" w:hAnsi="Consolas"/>
+          <w:sz w:val="20"/>
+          <w:szCs w:val="20"/>
+          <w:shd w:fill="F1F5F9"/>
+        </w:rPr>
+        <w:t xml:space="preserve">fe</w:t>
+      </w:r>
+      <w:r>
+        <w:rPr>
+          <w:rFonts w:ascii="Calibri" w:cs="Calibri" w:eastAsia="Calibri" w:hAnsi="Calibri"/>
+        </w:rPr>
+        <w:t xml:space="preserve">) build đạt 100% (Exit Code 0).</w:t>
+      </w:r>
+    </w:p>
+    <w:p>
+      <w:pPr>
+        <w:pBdr>
+          <w:bottom w:color="CBD5E1" w:sz="6" w:space="1"/>
+        </w:pBdr>
+        <w:spacing w:after="120" w:before="120"/>
+      </w:pPr>
+    </w:p>
+    <w:p>
+      <w:pPr>
+        <w:pStyle w:val="Heading2"/>
+        <w:spacing w:after="120" w:before="240"/>
+      </w:pPr>
+      <w:r>
+        <w:rPr>
+          <w:rFonts w:ascii="Calibri" w:cs="Calibri" w:eastAsia="Calibri" w:hAnsi="Calibri"/>
+          <w:b/>
+          <w:bCs/>
+          <w:color w:val="0F172A"/>
+          <w:sz w:val="28"/>
+          <w:szCs w:val="28"/>
+        </w:rPr>
+        <w:t xml:space="preserve">134. Chuẩn Hóa Phân Quyền Tạo Task Con: Chỉ Người Đảm Nhiệm Task (Assignee) Hoặc Quản Lý/Admin Được Phép Tạo</w:t>
+      </w:r>
+    </w:p>
+    <w:p>
+      <w:pPr>
+        <w:pStyle w:val="ListParagraph"/>
+        <w:numPr>
+          <w:ilvl w:val="0"/>
+          <w:numId w:val="1"/>
+        </w:numPr>
+        <w:spacing w:after="40" w:before="40"/>
+      </w:pPr>
+      <w:r>
+        <w:rPr>
+          <w:rFonts w:ascii="Calibri" w:cs="Calibri" w:eastAsia="Calibri" w:hAnsi="Calibri"/>
+          <w:b/>
+          <w:bCs/>
+        </w:rPr>
+        <w:t xml:space="preserve">File 1:</w:t>
+      </w:r>
+      <w:r>
+        <w:rPr>
+          <w:rFonts w:ascii="Calibri" w:cs="Calibri" w:eastAsia="Calibri" w:hAnsi="Calibri"/>
+        </w:rPr>
+        <w:t xml:space="preserve"> </w:t>
+      </w:r>
+      <w:r>
+        <w:rPr>
+          <w:rFonts w:ascii="Consolas" w:cs="Consolas" w:eastAsia="Consolas" w:hAnsi="Consolas"/>
+          <w:sz w:val="20"/>
+          <w:szCs w:val="20"/>
+          <w:shd w:fill="F1F5F9"/>
+        </w:rPr>
+        <w:t xml:space="preserve">be/src/modules/task/task.service.ts</w:t>
+      </w:r>
+      <w:r>
+        <w:rPr>
+          <w:rFonts w:ascii="Calibri" w:cs="Calibri" w:eastAsia="Calibri" w:hAnsi="Calibri"/>
+        </w:rPr>
+        <w:t xml:space="preserve">
+- </w:t>
+      </w:r>
+      <w:r>
+        <w:rPr>
+          <w:rFonts w:ascii="Calibri" w:cs="Calibri" w:eastAsia="Calibri" w:hAnsi="Calibri"/>
+          <w:b/>
+          <w:bCs/>
+        </w:rPr>
+        <w:t xml:space="preserve">Hành động:</w:t>
+      </w:r>
+      <w:r>
+        <w:rPr>
+          <w:rFonts w:ascii="Calibri" w:cs="Calibri" w:eastAsia="Calibri" w:hAnsi="Calibri"/>
+        </w:rPr>
+        <w:t xml:space="preserve"> </w:t>
+      </w:r>
+      <w:r>
+        <w:rPr>
+          <w:rFonts w:ascii="Consolas" w:cs="Consolas" w:eastAsia="Consolas" w:hAnsi="Consolas"/>
+          <w:sz w:val="20"/>
+          <w:szCs w:val="20"/>
+          <w:shd w:fill="F1F5F9"/>
+        </w:rPr>
+        <w:t xml:space="preserve">[THIẾT LẬP RÀNG BUỘC PHÂN QUYỀN CHẶT CHẼ TRONG ADDSUBTASK]</w:t>
+      </w:r>
+      <w:r>
+        <w:rPr>
+          <w:rFonts w:ascii="Calibri" w:cs="Calibri" w:eastAsia="Calibri" w:hAnsi="Calibri"/>
+        </w:rPr>
+        <w:t xml:space="preserve">.
+- </w:t>
+      </w:r>
+      <w:r>
+        <w:rPr>
+          <w:rFonts w:ascii="Calibri" w:cs="Calibri" w:eastAsia="Calibri" w:hAnsi="Calibri"/>
+          <w:b/>
+          <w:bCs/>
+        </w:rPr>
+        <w:t xml:space="preserve">Chi tiết:</w:t>
+      </w:r>
+      <w:r>
+        <w:rPr>
+          <w:rFonts w:ascii="Calibri" w:cs="Calibri" w:eastAsia="Calibri" w:hAnsi="Calibri"/>
+        </w:rPr>
+        <w:t xml:space="preserve"> Kiểm tra quyền </w:t>
+      </w:r>
+      <w:r>
+        <w:rPr>
+          <w:rFonts w:ascii="Consolas" w:cs="Consolas" w:eastAsia="Consolas" w:hAnsi="Consolas"/>
+          <w:sz w:val="20"/>
+          <w:szCs w:val="20"/>
+          <w:shd w:fill="F1F5F9"/>
+        </w:rPr>
+        <w:t xml:space="preserve">isAdminOrManager</w:t>
+      </w:r>
+      <w:r>
+        <w:rPr>
+          <w:rFonts w:ascii="Calibri" w:cs="Calibri" w:eastAsia="Calibri" w:hAnsi="Calibri"/>
+        </w:rPr>
+        <w:t xml:space="preserve"> hoặc </w:t>
+      </w:r>
+      <w:r>
+        <w:rPr>
+          <w:rFonts w:ascii="Consolas" w:cs="Consolas" w:eastAsia="Consolas" w:hAnsi="Consolas"/>
+          <w:sz w:val="20"/>
+          <w:szCs w:val="20"/>
+          <w:shd w:fill="F1F5F9"/>
+        </w:rPr>
+        <w:t xml:space="preserve">task.assigneeId === user.id</w:t>
+      </w:r>
+      <w:r>
+        <w:rPr>
+          <w:rFonts w:ascii="Calibri" w:cs="Calibri" w:eastAsia="Calibri" w:hAnsi="Calibri"/>
+        </w:rPr>
+        <w:t xml:space="preserve"> (nếu task chưa gán ai thì cho phép người tạo Task </w:t>
+      </w:r>
+      <w:r>
+        <w:rPr>
+          <w:rFonts w:ascii="Consolas" w:cs="Consolas" w:eastAsia="Consolas" w:hAnsi="Consolas"/>
+          <w:sz w:val="20"/>
+          <w:szCs w:val="20"/>
+          <w:shd w:fill="F1F5F9"/>
+        </w:rPr>
+        <w:t xml:space="preserve">task.createdById</w:t>
+      </w:r>
+      <w:r>
+        <w:rPr>
+          <w:rFonts w:ascii="Calibri" w:cs="Calibri" w:eastAsia="Calibri" w:hAnsi="Calibri"/>
+        </w:rPr>
+        <w:t xml:space="preserve">). Chặn các thành viên khác trong dự án không được tự ý can thiệp tạo subtask vào task của người khác.</w:t>
+      </w:r>
+    </w:p>
+    <w:p>
+      <w:pPr>
+        <w:pStyle w:val="ListParagraph"/>
+        <w:numPr>
+          <w:ilvl w:val="0"/>
+          <w:numId w:val="1"/>
+        </w:numPr>
+        <w:spacing w:after="40" w:before="40"/>
+      </w:pPr>
+      <w:r>
+        <w:rPr>
+          <w:rFonts w:ascii="Calibri" w:cs="Calibri" w:eastAsia="Calibri" w:hAnsi="Calibri"/>
+          <w:b/>
+          <w:bCs/>
+        </w:rPr>
         <w:t xml:space="preserve">File 2:</w:t>
       </w:r>
       <w:r>
@@ -36572,7 +37068,7 @@
           <w:szCs w:val="20"/>
           <w:shd w:fill="F1F5F9"/>
         </w:rPr>
-        <w:t xml:space="preserve">be/src/modules/task/task.service.ts</w:t>
+        <w:t xml:space="preserve">fe/src/components/kanban/TaskDetailModal.tsx</w:t>
       </w:r>
       <w:r>
         <w:rPr>
@@ -36602,7 +37098,7 @@
           <w:szCs w:val="20"/>
           <w:shd w:fill="F1F5F9"/>
         </w:rPr>
-        <w:t xml:space="preserve">[BỔ SUNG FIELD TYPE VÀ FORMAT NGÀY GIỜ VIỆT NAM TRONG API REQUESTS]</w:t>
+        <w:t xml:space="preserve">[CẬP NHẬT QUYỀN HIỂN THỊ CANMANAGESUBTASKS TRÊN GIAO DIỆN DETAIL MODAL]</w:t>
       </w:r>
       <w:r>
         <w:rPr>
@@ -36623,52 +37119,52 @@
         <w:rPr>
           <w:rFonts w:ascii="Calibri" w:cs="Calibri" w:eastAsia="Calibri" w:hAnsi="Calibri"/>
         </w:rPr>
-        <w:t xml:space="preserve"> Trả về đầy đủ </w:t>
-      </w:r>
-      <w:r>
-        <w:rPr>
-          <w:rFonts w:ascii="Consolas" w:cs="Consolas" w:eastAsia="Consolas" w:hAnsi="Consolas"/>
-          <w:sz w:val="20"/>
-          <w:szCs w:val="20"/>
-          <w:shd w:fill="F1F5F9"/>
-        </w:rPr>
-        <w:t xml:space="preserve">type</w:t>
-      </w:r>
-      <w:r>
-        <w:rPr>
-          <w:rFonts w:ascii="Calibri" w:cs="Calibri" w:eastAsia="Calibri" w:hAnsi="Calibri"/>
-        </w:rPr>
-        <w:t xml:space="preserve"> của yêu cầu và định dạng ngày giờ chuẩn Việt Nam trong </w:t>
-      </w:r>
-      <w:r>
-        <w:rPr>
-          <w:rFonts w:ascii="Consolas" w:cs="Consolas" w:eastAsia="Consolas" w:hAnsi="Consolas"/>
-          <w:sz w:val="20"/>
-          <w:szCs w:val="20"/>
-          <w:shd w:fill="F1F5F9"/>
-        </w:rPr>
-        <w:t xml:space="preserve">getIncomingRequests</w:t>
-      </w:r>
-      <w:r>
-        <w:rPr>
-          <w:rFonts w:ascii="Calibri" w:cs="Calibri" w:eastAsia="Calibri" w:hAnsi="Calibri"/>
-        </w:rPr>
-        <w:t xml:space="preserve"> và </w:t>
-      </w:r>
-      <w:r>
-        <w:rPr>
-          <w:rFonts w:ascii="Consolas" w:cs="Consolas" w:eastAsia="Consolas" w:hAnsi="Consolas"/>
-          <w:sz w:val="20"/>
-          <w:szCs w:val="20"/>
-          <w:shd w:fill="F1F5F9"/>
-        </w:rPr>
-        <w:t xml:space="preserve">getOutgoingRequests</w:t>
-      </w:r>
-      <w:r>
-        <w:rPr>
-          <w:rFonts w:ascii="Calibri" w:cs="Calibri" w:eastAsia="Calibri" w:hAnsi="Calibri"/>
-        </w:rPr>
-        <w:t xml:space="preserve">.</w:t>
+        <w:t xml:space="preserve"> Chỉ hiển thị thanh nhập Quick Add Subtask khi người dùng là </w:t>
+      </w:r>
+      <w:r>
+        <w:rPr>
+          <w:rFonts w:ascii="Consolas" w:cs="Consolas" w:eastAsia="Consolas" w:hAnsi="Consolas"/>
+          <w:sz w:val="20"/>
+          <w:szCs w:val="20"/>
+          <w:shd w:fill="F1F5F9"/>
+        </w:rPr>
+        <w:t xml:space="preserve">isAssignee</w:t>
+      </w:r>
+      <w:r>
+        <w:rPr>
+          <w:rFonts w:ascii="Calibri" w:cs="Calibri" w:eastAsia="Calibri" w:hAnsi="Calibri"/>
+        </w:rPr>
+        <w:t xml:space="preserve"> (người đảm nhiệm) hoặc Quản lý/Admin (</w:t>
+      </w:r>
+      <w:r>
+        <w:rPr>
+          <w:rFonts w:ascii="Consolas" w:cs="Consolas" w:eastAsia="Consolas" w:hAnsi="Consolas"/>
+          <w:sz w:val="20"/>
+          <w:szCs w:val="20"/>
+          <w:shd w:fill="F1F5F9"/>
+        </w:rPr>
+        <w:t xml:space="preserve">ADMIN</w:t>
+      </w:r>
+      <w:r>
+        <w:rPr>
+          <w:rFonts w:ascii="Calibri" w:cs="Calibri" w:eastAsia="Calibri" w:hAnsi="Calibri"/>
+        </w:rPr>
+        <w:t xml:space="preserve"> / </w:t>
+      </w:r>
+      <w:r>
+        <w:rPr>
+          <w:rFonts w:ascii="Consolas" w:cs="Consolas" w:eastAsia="Consolas" w:hAnsi="Consolas"/>
+          <w:sz w:val="20"/>
+          <w:szCs w:val="20"/>
+          <w:shd w:fill="F1F5F9"/>
+        </w:rPr>
+        <w:t xml:space="preserve">MANAGER</w:t>
+      </w:r>
+      <w:r>
+        <w:rPr>
+          <w:rFonts w:ascii="Calibri" w:cs="Calibri" w:eastAsia="Calibri" w:hAnsi="Calibri"/>
+        </w:rPr>
+        <w:t xml:space="preserve">).</w:t>
       </w:r>
     </w:p>
     <w:p>

</xml_diff>